<commit_message>
Separa el tema 5 de la práctica final
</commit_message>
<xml_diff>
--- a/material_original/fuentes/guias/Guia_de_estudio_Big_Data_Processing_II_2026-2027.docx
+++ b/material_original/fuentes/guias/Guia_de_estudio_Big_Data_Processing_II_2026-2027.docx
@@ -339,7 +339,7 @@
               <w:widowControl/>
             </w:pPr>
             <w:r>
-              <w:t>Esta edición se basa en la guía docente oficial publicada el 7 de julio de 2026 y en los materiales disponibles en el repositorio a 30 de septiembre de 2026. Los temas 5 y 6 forman parte del programa oficial, aunque sus presentaciones y fuentes editables aún están pendientes de incorporación.</w:t>
+              <w:t>Esta edición se basa en la guía docente oficial publicada el 7 de julio de 2026 y en los materiales disponibles en el repositorio a 30 de septiembre de 2026. Las presentaciones de los seis temas están incorporadas. Las fuentes LaTeX de los temas 5 y 6 son reconstrucciones documentadas a partir de sus PDF, no los originales de autor.</w:t>
             </w:r>
           </w:p>
         </w:tc>
@@ -801,7 +801,7 @@
               <w:rPr>
                 <w:sz w:val="17"/>
               </w:rPr>
-              <w:t>Proyecto integrado</w:t>
+              <w:t>Proyectos integrados</w:t>
             </w:r>
           </w:p>
         </w:tc>
@@ -820,7 +820,7 @@
               <w:rPr>
                 <w:sz w:val="17"/>
               </w:rPr>
-              <w:t>Material específico pendiente</w:t>
+              <w:t>Presentación · 46 diapositivas</w:t>
             </w:r>
           </w:p>
         </w:tc>
@@ -839,7 +839,7 @@
               <w:rPr>
                 <w:sz w:val="17"/>
               </w:rPr>
-              <w:t>Diseño, memoria, implementación y presentación</w:t>
+              <w:t>Ejercicio Text-to-SQL con Spark y LangGraph</w:t>
             </w:r>
           </w:p>
         </w:tc>
@@ -901,7 +901,7 @@
               <w:rPr>
                 <w:sz w:val="17"/>
               </w:rPr>
-              <w:t>Material específico pendiente</w:t>
+              <w:t>Presentación · 40 diapositivas</w:t>
             </w:r>
           </w:p>
         </w:tc>
@@ -2437,7 +2437,7 @@
         <w:widowControl/>
       </w:pPr>
       <w:r>
-        <w:t>Tema 5. Proyecto integrado: del dato en tiempo real al análisis automatizado</w:t>
+        <w:t>Tema 5. Proyectos integrados: del dato en tiempo real al análisis automatizado</w:t>
       </w:r>
     </w:p>
     <w:p>
@@ -2445,59 +2445,8 @@
         <w:spacing w:after="160"/>
       </w:pPr>
       <w:r>
-        <w:t>Bloque de síntesis en el que se diseña una arquitectura completa de ingestión, procesamiento, análisis y comunicación de resultados para un problema deportivo.</w:t>
+        <w:t>Bloque de integración tecnológica sobre sistemas que combinan ingestión continua, cómputo en streaming, recuperación de información, agentes e interfaces conversacionales. El ejercicio Text-to-SQL aplica estos contenidos; la práctica final es una actividad evaluable transversal sobre el temario completo.</w:t>
       </w:r>
-    </w:p>
-    <w:tbl>
-      <w:tblPr>
-        <w:tblW w:type="auto" w:w="0"/>
-        <w:jc w:val="center"/>
-        <w:tblLayout w:type="autofit"/>
-        <w:tblLook w:firstColumn="1" w:firstRow="1" w:lastColumn="0" w:lastRow="0" w:noHBand="0" w:noVBand="1" w:val="04A0"/>
-      </w:tblPr>
-      <w:tblGrid>
-        <w:gridCol w:w="9972"/>
-      </w:tblGrid>
-      <w:tr>
-        <w:tc>
-          <w:tcPr>
-            <w:tcW w:type="dxa" w:w="9972"/>
-            <w:shd w:fill="FFF2CC"/>
-            <w:tcMar>
-              <w:top w:w="150" w:type="dxa"/>
-              <w:start w:w="180" w:type="dxa"/>
-              <w:bottom w:w="150" w:type="dxa"/>
-              <w:end w:w="180" w:type="dxa"/>
-            </w:tcMar>
-          </w:tcPr>
-          <w:p>
-            <w:pPr>
-              <w:spacing w:after="80"/>
-            </w:pPr>
-            <w:r>
-              <w:rPr>
-                <w:b/>
-                <w:color w:val="17365D"/>
-              </w:rPr>
-              <w:t>Disponibilidad</w:t>
-            </w:r>
-          </w:p>
-          <w:p>
-            <w:pPr>
-              <w:spacing w:after="0"/>
-              <w:widowControl/>
-            </w:pPr>
-            <w:r>
-              <w:t>La ruta de trabajo queda definida por el programa oficial; la presentación y las fuentes propias del tema se añadirán cuando las aporte el equipo docente.</w:t>
-            </w:r>
-          </w:p>
-        </w:tc>
-      </w:tr>
-    </w:tbl>
-    <w:p>
-      <w:pPr>
-        <w:spacing w:after="0"/>
-      </w:pPr>
     </w:p>
     <w:p>
       <w:pPr>
@@ -2515,7 +2464,7 @@
         <w:widowControl/>
       </w:pPr>
       <w:r>
-        <w:t>Integrar streaming, almacenamiento, analítica e IA generativa en una solución coherente.</w:t>
+        <w:t>Comprender la transición desde el Business Intelligence retrospectivo hacia la analítica prescriptiva en tiempo real.</w:t>
       </w:r>
     </w:p>
     <w:p>
@@ -2524,7 +2473,7 @@
         <w:widowControl/>
       </w:pPr>
       <w:r>
-        <w:t>Traducir una necesidad de negocio o rendimiento deportivo en requisitos verificables.</w:t>
+        <w:t>Relacionar Kafka y Spark Structured Streaming dentro de una arquitectura completa de ingestión y procesamiento.</w:t>
       </w:r>
     </w:p>
     <w:p>
@@ -2533,7 +2482,7 @@
         <w:widowControl/>
       </w:pPr>
       <w:r>
-        <w:t>Planificar responsabilidades, interfaces, pruebas, despliegue y observabilidad.</w:t>
+        <w:t>Explicar cómo los flujos agénticos, las tools y el patrón ReAct conectan lenguaje natural con datos deportivos.</w:t>
       </w:r>
     </w:p>
     <w:p>
@@ -2542,7 +2491,7 @@
         <w:widowControl/>
       </w:pPr>
       <w:r>
-        <w:t>Comunicar resultados y limitaciones a perfiles técnicos y stakeholders.</w:t>
+        <w:t>Analizar el papel de RAG multimodal, la generación de narrativas y las interfaces conversacionales.</w:t>
       </w:r>
     </w:p>
     <w:p>
@@ -2561,7 +2510,7 @@
         <w:widowControl/>
       </w:pPr>
       <w:r>
-        <w:t>Guía docente y materiales de los temas 1–4.</w:t>
+        <w:t>BDPII_Tema_05_Proyecto_Integrado.pdf · 46 diapositivas.</w:t>
       </w:r>
     </w:p>
     <w:p>
@@ -2570,7 +2519,7 @@
         <w:widowControl/>
       </w:pPr>
       <w:r>
-        <w:t>Enunciado, rúbrica y plantillas que publique el equipo docente para el proyecto.</w:t>
+        <w:t>Ejercicio Text-to-SQL Agent con LangGraph y Apache Spark: README, código inicial, generador de datos y dependencias.</w:t>
       </w:r>
     </w:p>
     <w:p>
@@ -2579,7 +2528,7 @@
         <w:widowControl/>
       </w:pPr>
       <w:r>
-        <w:t>Material específico del tema 5: pendiente de incorporación al repositorio.</w:t>
+        <w:t>Materiales de los temas 1–4 como base conceptual y técnica.</w:t>
       </w:r>
     </w:p>
     <w:p>
@@ -2605,7 +2554,7 @@
         <w:t xml:space="preserve">1. </w:t>
       </w:r>
       <w:r>
-        <w:t>Definir problema, usuarios, decisión que debe apoyar el sistema y criterios de aceptación.</w:t>
+        <w:t>Estudiar el recorrido completo desde la telemetría hasta la decisión y representar los componentes del sistema.</w:t>
       </w:r>
     </w:p>
     <w:p>
@@ -2621,7 +2570,7 @@
         <w:t xml:space="preserve">2. </w:t>
       </w:r>
       <w:r>
-        <w:t>Inventariar fuentes de datos y requisitos de latencia, calidad, privacidad y disponibilidad.</w:t>
+        <w:t>Revisar particiones, semántica exactly-once, estado y watermarks en la integración Kafka-Spark.</w:t>
       </w:r>
     </w:p>
     <w:p>
@@ -2637,7 +2586,7 @@
         <w:t xml:space="preserve">3. </w:t>
       </w:r>
       <w:r>
-        <w:t>Diseñar arquitectura, contratos de datos, componentes y flujo de observabilidad.</w:t>
+        <w:t>Comparar workflows deterministas y agentes que consultan datos mediante tools.</w:t>
       </w:r>
     </w:p>
     <w:p>
@@ -2653,7 +2602,7 @@
         <w:t xml:space="preserve">4. </w:t>
       </w:r>
       <w:r>
-        <w:t>Construir un incremento mínimo reproducible y validarlo con datos de ejemplo.</w:t>
+        <w:t>Analizar cómo RAG multimodal y la generación de narrativas añaden contexto sin sustituir los cálculos deterministas.</w:t>
       </w:r>
     </w:p>
     <w:p>
@@ -2669,7 +2618,7 @@
         <w:t xml:space="preserve">5. </w:t>
       </w:r>
       <w:r>
-        <w:t>Evaluar rendimiento, calidad de resultados, fallos previsibles y controles humanos.</w:t>
+        <w:t>Completar el ejercicio Text-to-SQL: generar los datos, registrar las vistas de Spark y construir el agente ReAct.</w:t>
       </w:r>
     </w:p>
     <w:p>
@@ -2685,7 +2634,7 @@
         <w:t xml:space="preserve">6. </w:t>
       </w:r>
       <w:r>
-        <w:t>Preparar memoria, demostración y presentación con evidencias y limitaciones explícitas.</w:t>
+        <w:t>Validar el agente con consultas deportivas y comprobar que las respuestas se apoyan en los datos ejecutados.</w:t>
       </w:r>
     </w:p>
     <w:p>
@@ -2700,7 +2649,7 @@
     </w:p>
     <w:p>
       <w:r>
-        <w:t>Mantener un registro de decisiones arquitectónicas y una matriz que conecte requisito, componente, prueba, evidencia y riesgo residual.</w:t>
+        <w:t>Elaborar un diagrama razonado del sistema y una memoria breve del ejercicio Text-to-SQL que documente arquitectura, consultas probadas, resultados y límites del agente.</w:t>
       </w:r>
     </w:p>
     <w:p>
@@ -2726,57 +2675,6 @@
         <w:t>Bloque final de análisis crítico sobre tecnologías emergentes, analítica predictiva y prescriptiva, y los retos éticos y legales del uso masivo de datos e inteligencia artificial.</w:t>
       </w:r>
     </w:p>
-    <w:tbl>
-      <w:tblPr>
-        <w:tblW w:type="auto" w:w="0"/>
-        <w:jc w:val="center"/>
-        <w:tblLayout w:type="autofit"/>
-        <w:tblLook w:firstColumn="1" w:firstRow="1" w:lastColumn="0" w:lastRow="0" w:noHBand="0" w:noVBand="1" w:val="04A0"/>
-      </w:tblPr>
-      <w:tblGrid>
-        <w:gridCol w:w="9972"/>
-      </w:tblGrid>
-      <w:tr>
-        <w:tc>
-          <w:tcPr>
-            <w:tcW w:type="dxa" w:w="9972"/>
-            <w:shd w:fill="FFF2CC"/>
-            <w:tcMar>
-              <w:top w:w="150" w:type="dxa"/>
-              <w:start w:w="180" w:type="dxa"/>
-              <w:bottom w:w="150" w:type="dxa"/>
-              <w:end w:w="180" w:type="dxa"/>
-            </w:tcMar>
-          </w:tcPr>
-          <w:p>
-            <w:pPr>
-              <w:spacing w:after="80"/>
-            </w:pPr>
-            <w:r>
-              <w:rPr>
-                <w:b/>
-                <w:color w:val="17365D"/>
-              </w:rPr>
-              <w:t>Disponibilidad</w:t>
-            </w:r>
-          </w:p>
-          <w:p>
-            <w:pPr>
-              <w:spacing w:after="0"/>
-              <w:widowControl/>
-            </w:pPr>
-            <w:r>
-              <w:t>Este itinerario se apoya en el contenido oficial. Las presentaciones y fuentes editables del tema se incorporarán posteriormente sin alterar la secuencia general de la guía.</w:t>
-            </w:r>
-          </w:p>
-        </w:tc>
-      </w:tr>
-    </w:tbl>
-    <w:p>
-      <w:pPr>
-        <w:spacing w:after="0"/>
-      </w:pPr>
-    </w:p>
     <w:p>
       <w:pPr>
         <w:pStyle w:val="Heading2"/>
@@ -2839,6 +2737,15 @@
         <w:widowControl/>
       </w:pPr>
       <w:r>
+        <w:t>BDPII_Tema_06_Tendencias_Futuro.pdf · 40 diapositivas.</w:t>
+      </w:r>
+    </w:p>
+    <w:p>
+      <w:pPr>
+        <w:pStyle w:val="ListBullet"/>
+        <w:widowControl/>
+      </w:pPr>
+      <w:r>
         <w:t>Guía docente oficial y bibliografía básica y complementaria.</w:t>
       </w:r>
     </w:p>
@@ -2849,15 +2756,6 @@
       </w:pPr>
       <w:r>
         <w:t>Documentación técnica oficial y literatura científica seleccionada por el equipo docente.</w:t>
-      </w:r>
-    </w:p>
-    <w:p>
-      <w:pPr>
-        <w:pStyle w:val="ListBullet"/>
-        <w:widowControl/>
-      </w:pPr>
-      <w:r>
-        <w:t>Material específico del tema 6: pendiente de incorporación al repositorio.</w:t>
       </w:r>
     </w:p>
     <w:p>
@@ -3814,7 +3712,7 @@
               <w:rPr>
                 <w:sz w:val="18"/>
               </w:rPr>
-              <w:t>T5 · Definición del proyecto</w:t>
+              <w:t>T5 · Arquitectura integrada</w:t>
             </w:r>
           </w:p>
         </w:tc>
@@ -3833,7 +3731,7 @@
               <w:rPr>
                 <w:sz w:val="18"/>
               </w:rPr>
-              <w:t>Problema, stakeholders, requisitos, datos y criterios de aceptación.</w:t>
+              <w:t>Kafka, Spark, estado, RAG y agentes en un flujo de extremo a extremo.</w:t>
             </w:r>
           </w:p>
         </w:tc>
@@ -3875,7 +3773,7 @@
               <w:rPr>
                 <w:sz w:val="18"/>
               </w:rPr>
-              <w:t>T5 · Arquitectura e implementación</w:t>
+              <w:t>T5 · Text-to-SQL</w:t>
             </w:r>
           </w:p>
         </w:tc>
@@ -3895,7 +3793,7 @@
               <w:rPr>
                 <w:sz w:val="18"/>
               </w:rPr>
-              <w:t>Componentes, contratos, prototipo reproducible y pruebas.</w:t>
+              <w:t>Datos sintéticos, vistas Spark SQL, tools y construcción del agente ReAct.</w:t>
             </w:r>
           </w:p>
         </w:tc>
@@ -3935,7 +3833,7 @@
               <w:rPr>
                 <w:sz w:val="18"/>
               </w:rPr>
-              <w:t>T5 · Evaluación y comunicación</w:t>
+              <w:t>T5 · Narrativas e interfaces</w:t>
             </w:r>
           </w:p>
         </w:tc>
@@ -3954,7 +3852,7 @@
               <w:rPr>
                 <w:sz w:val="18"/>
               </w:rPr>
-              <w:t>Memoria, evidencia, demostración, visualización y presentación.</w:t>
+              <w:t>RAG multimodal, validación de respuestas y visualización conversacional.</w:t>
             </w:r>
           </w:p>
         </w:tc>
@@ -4130,7 +4028,7 @@
     </w:p>
     <w:p>
       <w:r>
-        <w:t>En prácticas y proyecto se recomienda distribuir responsabilidades sin fragmentar el conocimiento: cada integrante debe poder explicar el problema, la arquitectura, los datos, el código, las pruebas, los resultados y las limitaciones.</w:t>
+        <w:t>En las prácticas y en el proyecto final se recomienda distribuir responsabilidades sin fragmentar el conocimiento: cada integrante debe poder explicar el problema, la arquitectura, los datos, el código, las pruebas, los resultados y las limitaciones.</w:t>
       </w:r>
     </w:p>
     <w:p>
@@ -4150,7 +4048,7 @@
     </w:p>
     <w:p>
       <w:r>
-        <w:t>La evaluación oficial es continua. La guía docente establece tres componentes revaluables y exige una nota mínima de 5 en cada actividad. Las fechas concretas y cualquier ajuste deberán confirmarse siempre en Aula Virtual y con el equipo docente.</w:t>
+        <w:t>La evaluación oficial es continua. La guía docente establece tres componentes revaluables y exige una nota mínima de 5 en cada actividad. El proyecto final evalúa el temario completo y no constituye el contenido del tema 5. Las fechas concretas y cualquier ajuste deberán confirmarse siempre en Aula Virtual y con el equipo docente.</w:t>
       </w:r>
     </w:p>
     <w:tbl>
@@ -4998,7 +4896,7 @@
               <w:rPr>
                 <w:sz w:val="17"/>
               </w:rPr>
-              <w:t>Temas 1–4; auditoría pendiente</w:t>
+              <w:t>Temas 1–6; auditoría pendiente</w:t>
             </w:r>
           </w:p>
         </w:tc>
@@ -5080,7 +4978,7 @@
               <w:rPr>
                 <w:sz w:val="17"/>
               </w:rPr>
-              <w:t>Temas 1–4; temas 5–6 pendientes</w:t>
+              <w:t>Temas 1–6; las de T5–T6 son reconstrucciones desde PDF</w:t>
             </w:r>
           </w:p>
         </w:tc>
@@ -5158,7 +5056,7 @@
               <w:rPr>
                 <w:sz w:val="17"/>
               </w:rPr>
-              <w:t>Temas 2 y 4</w:t>
+              <w:t>Temas 2, 4 y 5; proyecto final separado</w:t>
             </w:r>
           </w:p>
         </w:tc>
@@ -5240,7 +5138,7 @@
               <w:rPr>
                 <w:sz w:val="17"/>
               </w:rPr>
-              <w:t>Temas 2 y 4</w:t>
+              <w:t>Temas 2 y 4; proyecto final</w:t>
             </w:r>
           </w:p>
         </w:tc>
@@ -5318,7 +5216,7 @@
               <w:rPr>
                 <w:sz w:val="17"/>
               </w:rPr>
-              <w:t>Temas 1, 2 y 4; revisión pendiente</w:t>
+              <w:t>Temas 1, 2, 4 y 5; revisión pendiente</w:t>
             </w:r>
           </w:p>
         </w:tc>
@@ -5370,56 +5268,10 @@
         <w:t>Solo las copias validadas pasarán al paquete definitivo de BURJC Digital.</w:t>
       </w:r>
     </w:p>
-    <w:tbl>
-      <w:tblPr>
-        <w:tblW w:type="auto" w:w="0"/>
-        <w:jc w:val="center"/>
-        <w:tblLayout w:type="autofit"/>
-        <w:tblLook w:firstColumn="1" w:firstRow="1" w:lastColumn="0" w:lastRow="0" w:noHBand="0" w:noVBand="1" w:val="04A0"/>
-      </w:tblPr>
-      <w:tblGrid>
-        <w:gridCol w:w="9972"/>
-      </w:tblGrid>
-      <w:tr>
-        <w:tc>
-          <w:tcPr>
-            <w:tcW w:type="dxa" w:w="9972"/>
-            <w:shd w:fill="DDEBF7"/>
-            <w:tcMar>
-              <w:top w:w="150" w:type="dxa"/>
-              <w:start w:w="180" w:type="dxa"/>
-              <w:bottom w:w="150" w:type="dxa"/>
-              <w:end w:w="180" w:type="dxa"/>
-            </w:tcMar>
-          </w:tcPr>
-          <w:p>
-            <w:pPr>
-              <w:spacing w:after="80"/>
-            </w:pPr>
-            <w:r>
-              <w:rPr>
-                <w:b/>
-                <w:color w:val="17365D"/>
-              </w:rPr>
-              <w:t>Actualización prevista</w:t>
-            </w:r>
-          </w:p>
-          <w:p>
-            <w:pPr>
-              <w:spacing w:after="0"/>
-              <w:widowControl/>
-            </w:pPr>
-            <w:r>
-              <w:t>Cuando se incorporen los materiales de los temas 5 y 6 se actualizarán el mapa de materiales y las actividades concretas, manteniendo los objetivos y la secuencia derivados de la guía docente.</w:t>
-            </w:r>
-          </w:p>
-        </w:tc>
-      </w:tr>
-    </w:tbl>
     <w:p>
-      <w:pPr>
-        <w:spacing w:after="0"/>
-      </w:pPr>
+      <w:r>
+        <w:t>Los PDF de los seis temas y el enunciado de la práctica final están incorporados. Las fuentes de los temas 5 y 6 son reconstrucciones desde PDF y están identificadas como tales. Continúa pendiente la auditoría previa a la publicación abierta.</w:t>
+      </w:r>
     </w:p>
     <w:p>
       <w:r>

</xml_diff>